<commit_message>
Add Brett Martin Ltd to the prospect list at John's direction
Flagged clearly as an exception to the list's own NI-exclusion
criterion - added on John's own relationship judgement (Newtownabbey,
Co. Antrim, family-owned), not on evidence, since no AI-specific
research was done. Kept as a one-off exception, not a change to the
standing rule for any other company. Updated the review markdown and
regenerated the Word document sent to Shane.

Co-Authored-By: Claude Sonnet 5 <noreply@anthropic.com>
Claude-Session: https://claude.ai/code/session_01MnUcS2wDWJvvkHN1TbrxoT
</commit_message>
<xml_diff>
--- a/cuan/exports/Qualified_100_AI_Adoption_Outreach_List.docx
+++ b/cuan/exports/Qualified_100_AI_Adoption_Outreach_List.docx
@@ -9805,6 +9805,236 @@
                 <w:szCs w:val="17"/>
               </w:rPr>
               <w:t xml:space="preserve">Well-known family brand, same summit attendance</w:t>
+            </w:r>
+          </w:p>
+        </w:tc>
+      </w:tr>
+    </w:tbl>
+    <w:p>
+      <w:pPr>
+        <w:spacing w:after="160"/>
+      </w:pPr>
+      <w:r>
+        <w:t xml:space="preserve"/>
+      </w:r>
+    </w:p>
+    <w:p>
+      <w:pPr>
+        <w:pStyle w:val="Heading3"/>
+        <w:spacing w:after="100" w:before="200"/>
+      </w:pPr>
+      <w:r>
+        <w:rPr>
+          <w:b/>
+          <w:bCs/>
+          <w:color w:val="1F2D3D"/>
+          <w:sz w:val="21"/>
+          <w:szCs w:val="21"/>
+        </w:rPr>
+        <w:t xml:space="preserve">Added at John's explicit direction, 19 Sept 2026 — flagged exception</w:t>
+      </w:r>
+    </w:p>
+    <w:tbl>
+      <w:tblPr>
+        <w:tblW w:type="dxa" w:w="16300"/>
+        <w:tblBorders>
+          <w:top w:val="single" w:color="auto" w:sz="4"/>
+          <w:left w:val="single" w:color="auto" w:sz="4"/>
+          <w:bottom w:val="single" w:color="auto" w:sz="4"/>
+          <w:right w:val="single" w:color="auto" w:sz="4"/>
+          <w:insideH w:val="single" w:color="auto" w:sz="4"/>
+          <w:insideV w:val="single" w:color="auto" w:sz="4"/>
+        </w:tblBorders>
+      </w:tblPr>
+      <w:tblGrid>
+        <w:gridCol w:w="2600"/>
+        <w:gridCol w:w="3400"/>
+        <w:gridCol w:w="4200"/>
+        <w:gridCol w:w="6100"/>
+      </w:tblGrid>
+      <w:tr>
+        <w:trPr>
+          <w:tblHeader/>
+        </w:trPr>
+        <w:tc>
+          <w:tcPr>
+            <w:tcW w:type="dxa" w:w="2600"/>
+            <w:shd w:fill="1F2D3D" w:val="clear"/>
+            <w:tcMar>
+              <w:top w:type="dxa" w:w="80"/>
+              <w:left w:type="dxa" w:w="100"/>
+              <w:bottom w:type="dxa" w:w="80"/>
+              <w:right w:type="dxa" w:w="100"/>
+            </w:tcMar>
+            <w:vAlign w:val="center"/>
+          </w:tcPr>
+          <w:p>
+            <w:r>
+              <w:rPr>
+                <w:b/>
+                <w:bCs/>
+                <w:color w:val="FFFFFF"/>
+                <w:sz w:val="18"/>
+                <w:szCs w:val="18"/>
+              </w:rPr>
+              <w:t xml:space="preserve">Company</w:t>
+            </w:r>
+          </w:p>
+        </w:tc>
+        <w:tc>
+          <w:tcPr>
+            <w:tcW w:type="dxa" w:w="3400"/>
+            <w:shd w:fill="1F2D3D" w:val="clear"/>
+            <w:tcMar>
+              <w:top w:type="dxa" w:w="80"/>
+              <w:left w:type="dxa" w:w="100"/>
+              <w:bottom w:type="dxa" w:w="80"/>
+              <w:right w:type="dxa" w:w="100"/>
+            </w:tcMar>
+            <w:vAlign w:val="center"/>
+          </w:tcPr>
+          <w:p>
+            <w:r>
+              <w:rPr>
+                <w:b/>
+                <w:bCs/>
+                <w:color w:val="FFFFFF"/>
+                <w:sz w:val="18"/>
+                <w:szCs w:val="18"/>
+              </w:rPr>
+              <w:t xml:space="preserve">Sector</w:t>
+            </w:r>
+          </w:p>
+        </w:tc>
+        <w:tc>
+          <w:tcPr>
+            <w:tcW w:type="dxa" w:w="4200"/>
+            <w:shd w:fill="1F2D3D" w:val="clear"/>
+            <w:tcMar>
+              <w:top w:type="dxa" w:w="80"/>
+              <w:left w:type="dxa" w:w="100"/>
+              <w:bottom w:type="dxa" w:w="80"/>
+              <w:right w:type="dxa" w:w="100"/>
+            </w:tcMar>
+            <w:vAlign w:val="center"/>
+          </w:tcPr>
+          <w:p>
+            <w:r>
+              <w:rPr>
+                <w:b/>
+                <w:bCs/>
+                <w:color w:val="FFFFFF"/>
+                <w:sz w:val="18"/>
+                <w:szCs w:val="18"/>
+              </w:rPr>
+              <w:t xml:space="preserve">Region</w:t>
+            </w:r>
+          </w:p>
+        </w:tc>
+        <w:tc>
+          <w:tcPr>
+            <w:tcW w:type="dxa" w:w="6100"/>
+            <w:shd w:fill="1F2D3D" w:val="clear"/>
+            <w:tcMar>
+              <w:top w:type="dxa" w:w="80"/>
+              <w:left w:type="dxa" w:w="100"/>
+              <w:bottom w:type="dxa" w:w="80"/>
+              <w:right w:type="dxa" w:w="100"/>
+            </w:tcMar>
+            <w:vAlign w:val="center"/>
+          </w:tcPr>
+          <w:p>
+            <w:r>
+              <w:rPr>
+                <w:b/>
+                <w:bCs/>
+                <w:color w:val="FFFFFF"/>
+                <w:sz w:val="18"/>
+                <w:szCs w:val="18"/>
+              </w:rPr>
+              <w:t xml:space="preserve">Reasoning</w:t>
+            </w:r>
+          </w:p>
+        </w:tc>
+      </w:tr>
+      <w:tr>
+        <w:tc>
+          <w:tcPr>
+            <w:tcW w:type="dxa" w:w="2600"/>
+            <w:tcMar>
+              <w:top w:type="dxa" w:w="70"/>
+              <w:left w:type="dxa" w:w="100"/>
+              <w:bottom w:type="dxa" w:w="70"/>
+              <w:right w:type="dxa" w:w="100"/>
+            </w:tcMar>
+          </w:tcPr>
+          <w:p>
+            <w:r>
+              <w:rPr>
+                <w:sz w:val="17"/>
+                <w:szCs w:val="17"/>
+              </w:rPr>
+              <w:t xml:space="preserve">Brett Martin Ltd</w:t>
+            </w:r>
+          </w:p>
+        </w:tc>
+        <w:tc>
+          <w:tcPr>
+            <w:tcW w:type="dxa" w:w="3400"/>
+            <w:tcMar>
+              <w:top w:type="dxa" w:w="70"/>
+              <w:left w:type="dxa" w:w="100"/>
+              <w:bottom w:type="dxa" w:w="70"/>
+              <w:right w:type="dxa" w:w="100"/>
+            </w:tcMar>
+          </w:tcPr>
+          <w:p>
+            <w:r>
+              <w:rPr>
+                <w:sz w:val="17"/>
+                <w:szCs w:val="17"/>
+              </w:rPr>
+              <w:t xml:space="preserve">Manufacturing (plastics/building products)</w:t>
+            </w:r>
+          </w:p>
+        </w:tc>
+        <w:tc>
+          <w:tcPr>
+            <w:tcW w:type="dxa" w:w="4200"/>
+            <w:tcMar>
+              <w:top w:type="dxa" w:w="70"/>
+              <w:left w:type="dxa" w:w="100"/>
+              <w:bottom w:type="dxa" w:w="70"/>
+              <w:right w:type="dxa" w:w="100"/>
+            </w:tcMar>
+          </w:tcPr>
+          <w:p>
+            <w:r>
+              <w:rPr>
+                <w:sz w:val="17"/>
+                <w:szCs w:val="17"/>
+              </w:rPr>
+              <w:t xml:space="preserve">Newtownabbey, Co. Antrim (Northern Ireland)</w:t>
+            </w:r>
+          </w:p>
+        </w:tc>
+        <w:tc>
+          <w:tcPr>
+            <w:tcW w:type="dxa" w:w="6100"/>
+            <w:tcMar>
+              <w:top w:type="dxa" w:w="70"/>
+              <w:left w:type="dxa" w:w="100"/>
+              <w:bottom w:type="dxa" w:w="70"/>
+              <w:right w:type="dxa" w:w="100"/>
+            </w:tcMar>
+          </w:tcPr>
+          <w:p>
+            <w:r>
+              <w:rPr>
+                <w:sz w:val="17"/>
+                <w:szCs w:val="17"/>
+              </w:rPr>
+              <w:t xml:space="preserve">Family-owned, large NI manufacturer. Deviates from the list's own NI-exclusion criterion (already applied elsewhere) — added at John's explicit direction on relationship judgement, not evidence. No AI-specific evidence researched or found. One-off exception, not a rule change.</w:t>
             </w:r>
           </w:p>
         </w:tc>

</xml_diff>